<commit_message>
> [resources/documents/consent-to-provide-information-about-the-author.docx] - change template
</commit_message>
<xml_diff>
--- a/resources/documents/consent-to-provide-information-about-the-author.docx
+++ b/resources/documents/consent-to-provide-information-about-the-author.docx
@@ -83,7 +83,31 @@
                 <w:szCs w:val="18"/>
                 <w:lang w:eastAsia="ru-RU"/>
               </w:rPr>
-              <w:t>(заполняется Федеральной службой  по интеллектуальной собственности)</w:t>
+              <w:t xml:space="preserve">(заполняется Федеральной </w:t>
+            </w:r>
+            <w:proofErr w:type="gramStart"/>
+            <w:r>
+              <w:rPr>
+                <w:rFonts w:ascii="Times New Roman" w:eastAsia="Calibri" w:hAnsi="Times New Roman"/>
+                <w:i/>
+                <w:iCs/>
+                <w:sz w:val="18"/>
+                <w:szCs w:val="18"/>
+                <w:lang w:eastAsia="ru-RU"/>
+              </w:rPr>
+              <w:t>службой  по</w:t>
+            </w:r>
+            <w:proofErr w:type="gramEnd"/>
+            <w:r>
+              <w:rPr>
+                <w:rFonts w:ascii="Times New Roman" w:eastAsia="Calibri" w:hAnsi="Times New Roman"/>
+                <w:i/>
+                <w:iCs/>
+                <w:sz w:val="18"/>
+                <w:szCs w:val="18"/>
+                <w:lang w:eastAsia="ru-RU"/>
+              </w:rPr>
+              <w:t xml:space="preserve"> интеллектуальной собственности)</w:t>
             </w:r>
           </w:p>
         </w:tc>
@@ -155,14 +179,25 @@
               <w:spacing w:after="0" w:line="240" w:lineRule="auto"/>
               <w:jc w:val="center"/>
             </w:pPr>
-            <w:r>
-              <w:rPr>
-                <w:rFonts w:ascii="Times New Roman" w:eastAsia="Calibri" w:hAnsi="Times New Roman"/>
-                <w:sz w:val="18"/>
-                <w:szCs w:val="18"/>
-                <w:lang w:eastAsia="ru-RU"/>
-              </w:rPr>
-              <w:t>Бережковская наб., д. 30, корп. 1,</w:t>
+            <w:proofErr w:type="spellStart"/>
+            <w:r>
+              <w:rPr>
+                <w:rFonts w:ascii="Times New Roman" w:eastAsia="Calibri" w:hAnsi="Times New Roman"/>
+                <w:sz w:val="18"/>
+                <w:szCs w:val="18"/>
+                <w:lang w:eastAsia="ru-RU"/>
+              </w:rPr>
+              <w:t>Бережковская</w:t>
+            </w:r>
+            <w:proofErr w:type="spellEnd"/>
+            <w:r>
+              <w:rPr>
+                <w:rFonts w:ascii="Times New Roman" w:eastAsia="Calibri" w:hAnsi="Times New Roman"/>
+                <w:sz w:val="18"/>
+                <w:szCs w:val="18"/>
+                <w:lang w:eastAsia="ru-RU"/>
+              </w:rPr>
+              <w:t xml:space="preserve"> наб., д. 30, корп. 1,</w:t>
             </w:r>
           </w:p>
           <w:p>
@@ -268,14 +303,25 @@
                 <w:lang w:eastAsia="ru-RU"/>
               </w:rPr>
             </w:pPr>
-            <w:r>
-              <w:rPr>
-                <w:rFonts w:ascii="Times New Roman" w:eastAsia="Calibri" w:hAnsi="Times New Roman"/>
-                <w:sz w:val="24"/>
-                <w:szCs w:val="24"/>
-                <w:lang w:eastAsia="ru-RU"/>
-              </w:rPr>
-              <w:t>Заявка  №  ____________________________________________________________</w:t>
+            <w:proofErr w:type="gramStart"/>
+            <w:r>
+              <w:rPr>
+                <w:rFonts w:ascii="Times New Roman" w:eastAsia="Calibri" w:hAnsi="Times New Roman"/>
+                <w:sz w:val="24"/>
+                <w:szCs w:val="24"/>
+                <w:lang w:eastAsia="ru-RU"/>
+              </w:rPr>
+              <w:t>Заявка  №</w:t>
+            </w:r>
+            <w:proofErr w:type="gramEnd"/>
+            <w:r>
+              <w:rPr>
+                <w:rFonts w:ascii="Times New Roman" w:eastAsia="Calibri" w:hAnsi="Times New Roman"/>
+                <w:sz w:val="24"/>
+                <w:szCs w:val="24"/>
+                <w:lang w:eastAsia="ru-RU"/>
+              </w:rPr>
+              <w:t xml:space="preserve">  ____________________________________________________________</w:t>
             </w:r>
           </w:p>
           <w:p>
@@ -637,6 +683,7 @@
                 <w:lang w:eastAsia="ru-RU"/>
               </w:rPr>
             </w:pPr>
+            <w:proofErr w:type="gramStart"/>
             <w:r>
               <w:rPr>
                 <w:rFonts w:ascii="Times New Roman" w:eastAsia="Calibri" w:hAnsi="Times New Roman"/>
@@ -657,6 +704,7 @@
               </w:rPr>
               <w:t>:_</w:t>
             </w:r>
+            <w:proofErr w:type="gramEnd"/>
             <w:r>
               <w:rPr>
                 <w:rFonts w:ascii="Times New Roman" w:eastAsia="Calibri" w:hAnsi="Times New Roman"/>
@@ -682,6 +730,7 @@
               </w:rPr>
               <w:t xml:space="preserve">{{ </w:t>
             </w:r>
+            <w:proofErr w:type="spellStart"/>
             <w:r>
               <w:rPr>
                 <w:rFonts w:ascii="Times New Roman" w:eastAsia="Calibri" w:hAnsi="Times New Roman"/>
@@ -694,6 +743,7 @@
               </w:rPr>
               <w:t>ibm</w:t>
             </w:r>
+            <w:proofErr w:type="spellEnd"/>
             <w:r>
               <w:rPr>
                 <w:rFonts w:ascii="Times New Roman" w:eastAsia="Calibri" w:hAnsi="Times New Roman"/>
@@ -764,7 +814,29 @@
                 <w:szCs w:val="17"/>
                 <w:lang w:eastAsia="ru-RU"/>
               </w:rPr>
-              <w:t>(указывается в  соответствии с графой 1 заявления о государственной регистрации программы для ЭВМ или базы данных)</w:t>
+              <w:t xml:space="preserve">(указывается </w:t>
+            </w:r>
+            <w:proofErr w:type="gramStart"/>
+            <w:r>
+              <w:rPr>
+                <w:rFonts w:ascii="Times New Roman" w:eastAsia="Calibri" w:hAnsi="Times New Roman"/>
+                <w:i/>
+                <w:sz w:val="17"/>
+                <w:szCs w:val="17"/>
+                <w:lang w:eastAsia="ru-RU"/>
+              </w:rPr>
+              <w:t>в  соответствии</w:t>
+            </w:r>
+            <w:proofErr w:type="gramEnd"/>
+            <w:r>
+              <w:rPr>
+                <w:rFonts w:ascii="Times New Roman" w:eastAsia="Calibri" w:hAnsi="Times New Roman"/>
+                <w:i/>
+                <w:sz w:val="17"/>
+                <w:szCs w:val="17"/>
+                <w:lang w:eastAsia="ru-RU"/>
+              </w:rPr>
+              <w:t xml:space="preserve"> с графой 1 заявления о государственной регистрации программы для ЭВМ или базы данных)</w:t>
             </w:r>
           </w:p>
         </w:tc>
@@ -808,7 +880,29 @@
                 <w:szCs w:val="18"/>
                 <w:lang w:eastAsia="ru-RU"/>
               </w:rPr>
-              <w:t xml:space="preserve">(указываются фамилия, имя, отчество (последнее – при наличии), место жительства физического лица, наименование, место нахождения, основной государственный регистрационный номер (ОГРН)  и идентификационный номер налогоплательщика (ИНН) юридического лица) </w:t>
+              <w:t>(указываются фамилия, имя, отчество (последнее – при наличии), место жительства физического лица, наименование, место нахождения, основной государственный регистрационный номер (</w:t>
+            </w:r>
+            <w:proofErr w:type="gramStart"/>
+            <w:r>
+              <w:rPr>
+                <w:rFonts w:ascii="Times New Roman" w:eastAsia="Calibri" w:hAnsi="Times New Roman"/>
+                <w:i/>
+                <w:sz w:val="18"/>
+                <w:szCs w:val="18"/>
+                <w:lang w:eastAsia="ru-RU"/>
+              </w:rPr>
+              <w:t>ОГРН)  и</w:t>
+            </w:r>
+            <w:proofErr w:type="gramEnd"/>
+            <w:r>
+              <w:rPr>
+                <w:rFonts w:ascii="Times New Roman" w:eastAsia="Calibri" w:hAnsi="Times New Roman"/>
+                <w:i/>
+                <w:sz w:val="18"/>
+                <w:szCs w:val="18"/>
+                <w:lang w:eastAsia="ru-RU"/>
+              </w:rPr>
+              <w:t xml:space="preserve"> идентификационный номер налогоплательщика (ИНН) юридического лица) </w:t>
             </w:r>
           </w:p>
           <w:p>
@@ -823,6 +917,7 @@
                 <w:lang w:val="en-US"/>
               </w:rPr>
             </w:pPr>
+            <w:proofErr w:type="gramStart"/>
             <w:r>
               <w:rPr>
                 <w:rFonts w:ascii="Times New Roman CYR" w:hAnsi="Times New Roman CYR" w:cs="Times New Roman CYR"/>
@@ -832,7 +927,43 @@
                 <w:u w:val="single"/>
                 <w:lang w:val="en-US" w:eastAsia="ru-RU"/>
               </w:rPr>
-              <w:t>{{ physical_person_data }}</w:t>
+              <w:t xml:space="preserve">{{ </w:t>
+            </w:r>
+            <w:proofErr w:type="spellStart"/>
+            <w:r>
+              <w:rPr>
+                <w:rFonts w:ascii="Times New Roman CYR" w:hAnsi="Times New Roman CYR" w:cs="Times New Roman CYR"/>
+                <w:b/>
+                <w:sz w:val="24"/>
+                <w:szCs w:val="24"/>
+                <w:u w:val="single"/>
+                <w:lang w:val="en-US" w:eastAsia="ru-RU"/>
+              </w:rPr>
+              <w:t>physical</w:t>
+            </w:r>
+            <w:proofErr w:type="gramEnd"/>
+            <w:r>
+              <w:rPr>
+                <w:rFonts w:ascii="Times New Roman CYR" w:hAnsi="Times New Roman CYR" w:cs="Times New Roman CYR"/>
+                <w:b/>
+                <w:sz w:val="24"/>
+                <w:szCs w:val="24"/>
+                <w:u w:val="single"/>
+                <w:lang w:val="en-US" w:eastAsia="ru-RU"/>
+              </w:rPr>
+              <w:t>_person_data</w:t>
+            </w:r>
+            <w:proofErr w:type="spellEnd"/>
+            <w:r>
+              <w:rPr>
+                <w:rFonts w:ascii="Times New Roman CYR" w:hAnsi="Times New Roman CYR" w:cs="Times New Roman CYR"/>
+                <w:b/>
+                <w:sz w:val="24"/>
+                <w:szCs w:val="24"/>
+                <w:u w:val="single"/>
+                <w:lang w:val="en-US" w:eastAsia="ru-RU"/>
+              </w:rPr>
+              <w:t xml:space="preserve"> }}</w:t>
             </w:r>
           </w:p>
           <w:p>
@@ -851,6 +982,7 @@
                 <w:lang w:val="en-US"/>
               </w:rPr>
             </w:pPr>
+            <w:proofErr w:type="gramStart"/>
             <w:r>
               <w:rPr>
                 <w:rFonts w:ascii="Times New Roman CYR" w:hAnsi="Times New Roman CYR" w:cs="Times New Roman CYR"/>
@@ -860,7 +992,43 @@
                 <w:u w:val="single"/>
                 <w:lang w:val="en-US" w:eastAsia="ru-RU"/>
               </w:rPr>
-              <w:t>{{ juridical_person_data }}</w:t>
+              <w:t xml:space="preserve">{{ </w:t>
+            </w:r>
+            <w:proofErr w:type="spellStart"/>
+            <w:r>
+              <w:rPr>
+                <w:rFonts w:ascii="Times New Roman CYR" w:hAnsi="Times New Roman CYR" w:cs="Times New Roman CYR"/>
+                <w:b/>
+                <w:sz w:val="24"/>
+                <w:szCs w:val="24"/>
+                <w:u w:val="single"/>
+                <w:lang w:val="en-US" w:eastAsia="ru-RU"/>
+              </w:rPr>
+              <w:t>juridical</w:t>
+            </w:r>
+            <w:proofErr w:type="gramEnd"/>
+            <w:r>
+              <w:rPr>
+                <w:rFonts w:ascii="Times New Roman CYR" w:hAnsi="Times New Roman CYR" w:cs="Times New Roman CYR"/>
+                <w:b/>
+                <w:sz w:val="24"/>
+                <w:szCs w:val="24"/>
+                <w:u w:val="single"/>
+                <w:lang w:val="en-US" w:eastAsia="ru-RU"/>
+              </w:rPr>
+              <w:t>_person_data</w:t>
+            </w:r>
+            <w:proofErr w:type="spellEnd"/>
+            <w:r>
+              <w:rPr>
+                <w:rFonts w:ascii="Times New Roman CYR" w:hAnsi="Times New Roman CYR" w:cs="Times New Roman CYR"/>
+                <w:b/>
+                <w:sz w:val="24"/>
+                <w:szCs w:val="24"/>
+                <w:u w:val="single"/>
+                <w:lang w:val="en-US" w:eastAsia="ru-RU"/>
+              </w:rPr>
+              <w:t xml:space="preserve"> }}</w:t>
             </w:r>
             <w:r>
               <w:rPr>
@@ -938,11 +1106,22 @@
                 <w:sz w:val="20"/>
                 <w:szCs w:val="20"/>
               </w:rPr>
-              <w:t>Фамилия имя отчество:</w:t>
-            </w:r>
+              <w:t xml:space="preserve">Фамилия имя </w:t>
+            </w:r>
+            <w:proofErr w:type="gramStart"/>
             <w:r>
               <w:rPr>
                 <w:rFonts w:ascii="Times New Roman" w:hAnsi="Times New Roman"/>
+                <w:bCs/>
+                <w:i/>
+                <w:sz w:val="20"/>
+                <w:szCs w:val="20"/>
+              </w:rPr>
+              <w:t>отчество:</w:t>
+            </w:r>
+            <w:r>
+              <w:rPr>
+                <w:rFonts w:ascii="Times New Roman" w:hAnsi="Times New Roman"/>
                 <w:b/>
                 <w:bCs/>
                 <w:sz w:val="24"/>
@@ -958,248 +1137,438 @@
                 <w:sz w:val="24"/>
                 <w:szCs w:val="24"/>
               </w:rPr>
+              <w:t>{</w:t>
+            </w:r>
+            <w:proofErr w:type="gramEnd"/>
+            <w:r>
+              <w:rPr>
+                <w:rFonts w:ascii="Times New Roman" w:hAnsi="Times New Roman"/>
+                <w:b/>
+                <w:bCs/>
+                <w:sz w:val="24"/>
+                <w:szCs w:val="24"/>
+              </w:rPr>
+              <w:t xml:space="preserve">{ </w:t>
+            </w:r>
+            <w:r>
+              <w:rPr>
+                <w:rFonts w:ascii="Times New Roman" w:hAnsi="Times New Roman"/>
+                <w:b/>
+                <w:bCs/>
+                <w:sz w:val="24"/>
+                <w:szCs w:val="24"/>
+                <w:lang w:val="en-US"/>
+              </w:rPr>
+              <w:t>authors</w:t>
+            </w:r>
+            <w:r>
+              <w:rPr>
+                <w:rFonts w:ascii="Times New Roman" w:hAnsi="Times New Roman"/>
+                <w:b/>
+                <w:bCs/>
+                <w:sz w:val="24"/>
+                <w:szCs w:val="24"/>
+              </w:rPr>
+              <w:t>_</w:t>
+            </w:r>
+            <w:r>
+              <w:rPr>
+                <w:rFonts w:ascii="Times New Roman" w:hAnsi="Times New Roman"/>
+                <w:b/>
+                <w:bCs/>
+                <w:sz w:val="24"/>
+                <w:szCs w:val="24"/>
+                <w:lang w:val="en-US"/>
+              </w:rPr>
+              <w:t>name</w:t>
+            </w:r>
+            <w:r>
+              <w:rPr>
+                <w:rFonts w:ascii="Times New Roman" w:hAnsi="Times New Roman"/>
+                <w:b/>
+                <w:bCs/>
+                <w:sz w:val="24"/>
+                <w:szCs w:val="24"/>
+              </w:rPr>
+              <w:t xml:space="preserve"> }}</w:t>
+            </w:r>
+          </w:p>
+          <w:p>
+            <w:pPr>
+              <w:pStyle w:val="western"/>
+            </w:pPr>
+            <w:r>
+              <w:rPr>
+                <w:rFonts w:eastAsia="Calibri"/>
+                <w:i/>
+                <w:sz w:val="20"/>
+                <w:szCs w:val="20"/>
+              </w:rPr>
+              <w:t xml:space="preserve">Дата </w:t>
+            </w:r>
+            <w:proofErr w:type="gramStart"/>
+            <w:r>
+              <w:rPr>
+                <w:rFonts w:eastAsia="Calibri"/>
+                <w:i/>
+                <w:sz w:val="20"/>
+                <w:szCs w:val="20"/>
+              </w:rPr>
+              <w:t>рождения:  число</w:t>
+            </w:r>
+            <w:proofErr w:type="gramEnd"/>
+            <w:r>
+              <w:rPr>
+                <w:rFonts w:eastAsia="Calibri"/>
+                <w:i/>
+                <w:sz w:val="20"/>
+                <w:szCs w:val="20"/>
+              </w:rPr>
+              <w:t>:</w:t>
+            </w:r>
+            <w:r>
+              <w:rPr>
+                <w:rFonts w:eastAsia="Calibri"/>
+                <w:b/>
+                <w:bCs/>
+                <w:sz w:val="18"/>
+                <w:szCs w:val="18"/>
+              </w:rPr>
+              <w:t xml:space="preserve"> </w:t>
+            </w:r>
+            <w:r>
+              <w:rPr>
+                <w:b/>
+                <w:bCs/>
+                <w:sz w:val="20"/>
+                <w:szCs w:val="20"/>
+                <w:u w:val="single"/>
+              </w:rPr>
+              <w:t>__</w:t>
+            </w:r>
+            <w:r>
+              <w:rPr>
+                <w:b/>
+                <w:bCs/>
+                <w:color w:val="000000" w:themeColor="text1"/>
+                <w:sz w:val="20"/>
+                <w:szCs w:val="20"/>
+                <w:u w:val="single"/>
+              </w:rPr>
+              <w:t>{{</w:t>
+            </w:r>
+            <w:r>
+              <w:rPr>
+                <w:b/>
+                <w:bCs/>
+                <w:color w:val="000000" w:themeColor="text1"/>
+                <w:sz w:val="20"/>
+                <w:szCs w:val="20"/>
+                <w:u w:val="single"/>
+                <w:lang w:val="en-US"/>
+              </w:rPr>
+              <w:t>born</w:t>
+            </w:r>
+            <w:r>
+              <w:rPr>
+                <w:b/>
+                <w:bCs/>
+                <w:color w:val="000000" w:themeColor="text1"/>
+                <w:sz w:val="20"/>
+                <w:szCs w:val="20"/>
+                <w:u w:val="single"/>
+              </w:rPr>
+              <w:t>_</w:t>
+            </w:r>
+            <w:r>
+              <w:rPr>
+                <w:b/>
+                <w:bCs/>
+                <w:color w:val="000000" w:themeColor="text1"/>
+                <w:sz w:val="20"/>
+                <w:szCs w:val="20"/>
+                <w:u w:val="single"/>
+                <w:lang w:val="en-US"/>
+              </w:rPr>
+              <w:t>day</w:t>
+            </w:r>
+            <w:r>
+              <w:rPr>
+                <w:b/>
+                <w:bCs/>
+                <w:color w:val="000000" w:themeColor="text1"/>
+                <w:sz w:val="20"/>
+                <w:szCs w:val="20"/>
+                <w:u w:val="single"/>
+              </w:rPr>
+              <w:t>}}</w:t>
+            </w:r>
+            <w:r>
+              <w:rPr>
+                <w:b/>
+                <w:bCs/>
+                <w:sz w:val="20"/>
+                <w:szCs w:val="20"/>
+                <w:u w:val="single"/>
+              </w:rPr>
+              <w:t>____</w:t>
+            </w:r>
+            <w:r>
+              <w:rPr>
+                <w:i/>
+                <w:iCs/>
+                <w:sz w:val="20"/>
+                <w:szCs w:val="20"/>
+                <w:u w:val="single"/>
+              </w:rPr>
+              <w:t xml:space="preserve"> месяц:</w:t>
+            </w:r>
+            <w:r>
+              <w:rPr>
+                <w:b/>
+                <w:bCs/>
+                <w:sz w:val="20"/>
+                <w:szCs w:val="20"/>
+                <w:u w:val="single"/>
+              </w:rPr>
+              <w:t xml:space="preserve"> __</w:t>
+            </w:r>
+            <w:r>
+              <w:rPr>
+                <w:b/>
+                <w:bCs/>
+                <w:color w:val="000000" w:themeColor="text1"/>
+                <w:sz w:val="20"/>
+                <w:szCs w:val="20"/>
+                <w:u w:val="single"/>
+              </w:rPr>
+              <w:t>{{</w:t>
+            </w:r>
+            <w:r>
+              <w:rPr>
+                <w:b/>
+                <w:bCs/>
+                <w:color w:val="000000" w:themeColor="text1"/>
+                <w:sz w:val="20"/>
+                <w:szCs w:val="20"/>
+                <w:u w:val="single"/>
+                <w:lang w:val="en-US"/>
+              </w:rPr>
+              <w:t>born</w:t>
+            </w:r>
+            <w:r>
+              <w:rPr>
+                <w:b/>
+                <w:bCs/>
+                <w:color w:val="000000" w:themeColor="text1"/>
+                <w:sz w:val="20"/>
+                <w:szCs w:val="20"/>
+                <w:u w:val="single"/>
+              </w:rPr>
+              <w:t>_</w:t>
+            </w:r>
+            <w:r>
+              <w:rPr>
+                <w:b/>
+                <w:bCs/>
+                <w:color w:val="000000" w:themeColor="text1"/>
+                <w:sz w:val="20"/>
+                <w:szCs w:val="20"/>
+                <w:u w:val="single"/>
+                <w:lang w:val="en-US"/>
+              </w:rPr>
+              <w:t>month</w:t>
+            </w:r>
+            <w:r>
+              <w:rPr>
+                <w:b/>
+                <w:bCs/>
+                <w:color w:val="000000" w:themeColor="text1"/>
+                <w:sz w:val="20"/>
+                <w:szCs w:val="20"/>
+                <w:u w:val="single"/>
+              </w:rPr>
+              <w:t>}}</w:t>
+            </w:r>
+            <w:r>
+              <w:rPr>
+                <w:b/>
+                <w:bCs/>
+                <w:sz w:val="20"/>
+                <w:szCs w:val="20"/>
+                <w:u w:val="single"/>
+              </w:rPr>
+              <w:t>____</w:t>
+            </w:r>
+            <w:r>
+              <w:rPr>
+                <w:i/>
+                <w:iCs/>
+                <w:sz w:val="20"/>
+                <w:szCs w:val="20"/>
+                <w:u w:val="single"/>
+              </w:rPr>
+              <w:t xml:space="preserve"> год:</w:t>
+            </w:r>
+            <w:r>
+              <w:rPr>
+                <w:b/>
+                <w:bCs/>
+                <w:sz w:val="20"/>
+                <w:szCs w:val="20"/>
+                <w:u w:val="single"/>
+              </w:rPr>
+              <w:t xml:space="preserve"> _</w:t>
+            </w:r>
+            <w:r>
+              <w:rPr>
+                <w:b/>
+                <w:bCs/>
+                <w:color w:val="000000" w:themeColor="text1"/>
+                <w:sz w:val="20"/>
+                <w:szCs w:val="20"/>
+                <w:u w:val="single"/>
+              </w:rPr>
+              <w:t>{{</w:t>
+            </w:r>
+            <w:r>
+              <w:rPr>
+                <w:b/>
+                <w:bCs/>
+                <w:color w:val="000000" w:themeColor="text1"/>
+                <w:sz w:val="20"/>
+                <w:szCs w:val="20"/>
+                <w:u w:val="single"/>
+                <w:lang w:val="en-US"/>
+              </w:rPr>
+              <w:t>born</w:t>
+            </w:r>
+            <w:r>
+              <w:rPr>
+                <w:b/>
+                <w:bCs/>
+                <w:color w:val="000000" w:themeColor="text1"/>
+                <w:sz w:val="20"/>
+                <w:szCs w:val="20"/>
+                <w:u w:val="single"/>
+              </w:rPr>
+              <w:t>_</w:t>
+            </w:r>
+            <w:r>
+              <w:rPr>
+                <w:b/>
+                <w:bCs/>
+                <w:color w:val="000000" w:themeColor="text1"/>
+                <w:sz w:val="20"/>
+                <w:szCs w:val="20"/>
+                <w:u w:val="single"/>
+                <w:lang w:val="en-US"/>
+              </w:rPr>
+              <w:t>year</w:t>
+            </w:r>
+            <w:r>
+              <w:rPr>
+                <w:b/>
+                <w:bCs/>
+                <w:color w:val="000000" w:themeColor="text1"/>
+                <w:sz w:val="20"/>
+                <w:szCs w:val="20"/>
+                <w:u w:val="single"/>
+              </w:rPr>
+              <w:t>}}</w:t>
+            </w:r>
+            <w:r>
+              <w:rPr>
+                <w:b/>
+                <w:bCs/>
+                <w:sz w:val="20"/>
+                <w:szCs w:val="20"/>
+                <w:u w:val="single"/>
+              </w:rPr>
+              <w:t>____</w:t>
+            </w:r>
+            <w:r>
+              <w:rPr>
+                <w:b/>
+                <w:bCs/>
+                <w:sz w:val="20"/>
+                <w:szCs w:val="20"/>
+                <w:u w:val="single"/>
+              </w:rPr>
+              <w:t xml:space="preserve"> </w:t>
+            </w:r>
+            <w:r>
+              <w:rPr>
+                <w:rFonts w:eastAsia="Calibri"/>
+                <w:i/>
+                <w:sz w:val="20"/>
+                <w:szCs w:val="20"/>
+              </w:rPr>
+              <w:t xml:space="preserve"> Гражданство:</w:t>
+            </w:r>
+            <w:r>
+              <w:rPr>
+                <w:rFonts w:eastAsia="Calibri"/>
+                <w:b/>
+                <w:bCs/>
+                <w:sz w:val="18"/>
+                <w:szCs w:val="18"/>
+              </w:rPr>
+              <w:t xml:space="preserve"> </w:t>
+            </w:r>
+            <w:r>
+              <w:rPr>
+                <w:rFonts w:eastAsia="Calibri"/>
+                <w:b/>
+                <w:bCs/>
+                <w:sz w:val="20"/>
+                <w:szCs w:val="20"/>
+                <w:u w:val="single"/>
+              </w:rPr>
+              <w:t>_</w:t>
+            </w:r>
+            <w:r>
+              <w:rPr>
+                <w:rFonts w:eastAsia="Calibri"/>
+                <w:b/>
+                <w:bCs/>
+                <w:sz w:val="20"/>
+                <w:szCs w:val="20"/>
+                <w:u w:val="single"/>
+              </w:rPr>
               <w:t xml:space="preserve">{{ </w:t>
             </w:r>
             <w:r>
               <w:rPr>
-                <w:rFonts w:ascii="Times New Roman" w:hAnsi="Times New Roman"/>
-                <w:b/>
-                <w:bCs/>
-                <w:sz w:val="24"/>
-                <w:szCs w:val="24"/>
+                <w:rFonts w:eastAsia="Calibri"/>
+                <w:b/>
+                <w:bCs/>
+                <w:sz w:val="20"/>
+                <w:szCs w:val="20"/>
+                <w:u w:val="single"/>
                 <w:lang w:val="en-US"/>
               </w:rPr>
-              <w:t>authors</w:t>
-            </w:r>
-            <w:r>
-              <w:rPr>
-                <w:rFonts w:ascii="Times New Roman" w:hAnsi="Times New Roman"/>
-                <w:b/>
-                <w:bCs/>
-                <w:sz w:val="24"/>
-                <w:szCs w:val="24"/>
-              </w:rPr>
-              <w:t>_</w:t>
-            </w:r>
-            <w:r>
-              <w:rPr>
-                <w:rFonts w:ascii="Times New Roman" w:hAnsi="Times New Roman"/>
-                <w:b/>
-                <w:bCs/>
-                <w:sz w:val="24"/>
-                <w:szCs w:val="24"/>
-                <w:lang w:val="en-US"/>
-              </w:rPr>
-              <w:t>name</w:t>
-            </w:r>
-            <w:r>
-              <w:rPr>
-                <w:rFonts w:ascii="Times New Roman" w:hAnsi="Times New Roman"/>
-                <w:b/>
-                <w:bCs/>
-                <w:sz w:val="24"/>
-                <w:szCs w:val="24"/>
+              <w:t>citizenship</w:t>
+            </w:r>
+            <w:r>
+              <w:rPr>
+                <w:rFonts w:eastAsia="Calibri"/>
+                <w:b/>
+                <w:bCs/>
+                <w:sz w:val="20"/>
+                <w:szCs w:val="20"/>
+                <w:u w:val="single"/>
               </w:rPr>
               <w:t xml:space="preserve"> }}</w:t>
             </w:r>
-          </w:p>
-          <w:p>
-            <w:pPr>
-              <w:widowControl w:val="0"/>
-              <w:spacing w:after="0" w:line="360" w:lineRule="auto"/>
-              <w:ind w:firstLine="72"/>
-              <w:rPr>
-                <w:rFonts w:ascii="Times New Roman" w:eastAsia="Calibri" w:hAnsi="Times New Roman"/>
-                <w:b/>
-                <w:bCs/>
-                <w:sz w:val="18"/>
-                <w:szCs w:val="18"/>
-                <w:lang w:eastAsia="ru-RU"/>
-              </w:rPr>
-            </w:pPr>
-            <w:r>
-              <w:rPr>
-                <w:rFonts w:ascii="Times New Roman" w:eastAsia="Calibri" w:hAnsi="Times New Roman"/>
-                <w:i/>
-                <w:sz w:val="20"/>
-                <w:szCs w:val="20"/>
-                <w:lang w:eastAsia="ru-RU"/>
-              </w:rPr>
-              <w:t>Дата рождения:  число:</w:t>
-            </w:r>
-            <w:r>
-              <w:rPr>
-                <w:rFonts w:ascii="Times New Roman" w:eastAsia="Calibri" w:hAnsi="Times New Roman"/>
-                <w:b/>
-                <w:bCs/>
-                <w:sz w:val="18"/>
-                <w:szCs w:val="18"/>
-                <w:lang w:eastAsia="ru-RU"/>
-              </w:rPr>
-              <w:t xml:space="preserve"> </w:t>
-            </w:r>
-            <w:r>
-              <w:rPr>
-                <w:rFonts w:ascii="Times New Roman" w:eastAsia="Calibri" w:hAnsi="Times New Roman"/>
-                <w:b/>
-                <w:bCs/>
-                <w:sz w:val="20"/>
-                <w:szCs w:val="20"/>
-                <w:u w:val="single"/>
-                <w:lang w:eastAsia="ru-RU"/>
-              </w:rPr>
-              <w:t>__</w:t>
-            </w:r>
-            <w:r>
-              <w:rPr>
-                <w:rFonts w:ascii="Times New Roman" w:eastAsia="Calibri" w:hAnsi="Times New Roman"/>
-                <w:b/>
-                <w:bCs/>
-                <w:sz w:val="20"/>
-                <w:szCs w:val="20"/>
-                <w:u w:val="single"/>
-                <w:lang w:eastAsia="ru-RU"/>
-              </w:rPr>
-              <w:t xml:space="preserve">{{ </w:t>
-            </w:r>
-            <w:r>
-              <w:rPr>
-                <w:rFonts w:ascii="Times New Roman" w:eastAsia="Calibri" w:hAnsi="Times New Roman"/>
-                <w:b/>
-                <w:bCs/>
-                <w:sz w:val="20"/>
-                <w:szCs w:val="20"/>
-                <w:u w:val="single"/>
-                <w:lang w:val="en-US" w:eastAsia="ru-RU"/>
-              </w:rPr>
-              <w:t>born</w:t>
-            </w:r>
-            <w:r>
-              <w:rPr>
-                <w:rFonts w:ascii="Times New Roman" w:eastAsia="Calibri" w:hAnsi="Times New Roman"/>
-                <w:b/>
-                <w:bCs/>
-                <w:sz w:val="20"/>
-                <w:szCs w:val="20"/>
-                <w:u w:val="single"/>
-                <w:lang w:eastAsia="ru-RU"/>
-              </w:rPr>
-              <w:t>_</w:t>
-            </w:r>
-            <w:r>
-              <w:rPr>
-                <w:rFonts w:ascii="Times New Roman" w:eastAsia="Calibri" w:hAnsi="Times New Roman"/>
-                <w:b/>
-                <w:bCs/>
-                <w:sz w:val="20"/>
-                <w:szCs w:val="20"/>
-                <w:u w:val="single"/>
-                <w:lang w:val="en-US" w:eastAsia="ru-RU"/>
-              </w:rPr>
-              <w:t>data</w:t>
-            </w:r>
-            <w:r>
-              <w:rPr>
-                <w:rFonts w:ascii="Times New Roman" w:eastAsia="Calibri" w:hAnsi="Times New Roman"/>
-                <w:b/>
-                <w:bCs/>
-                <w:sz w:val="20"/>
-                <w:szCs w:val="20"/>
-                <w:u w:val="single"/>
-                <w:lang w:eastAsia="ru-RU"/>
-              </w:rPr>
-              <w:t xml:space="preserve"> }}</w:t>
-            </w:r>
-            <w:r>
-              <w:rPr>
-                <w:rFonts w:ascii="Times New Roman" w:eastAsia="Calibri" w:hAnsi="Times New Roman"/>
-                <w:b/>
-                <w:bCs/>
-                <w:sz w:val="20"/>
-                <w:szCs w:val="20"/>
-                <w:u w:val="single"/>
-                <w:lang w:eastAsia="ru-RU"/>
-              </w:rPr>
-              <w:t>_</w:t>
-            </w:r>
-            <w:r>
-              <w:rPr>
-                <w:rFonts w:ascii="Times New Roman" w:eastAsia="Calibri" w:hAnsi="Times New Roman"/>
-                <w:i/>
-                <w:sz w:val="20"/>
-                <w:szCs w:val="20"/>
-                <w:lang w:eastAsia="ru-RU"/>
-              </w:rPr>
-              <w:t xml:space="preserve"> Гражданство:</w:t>
-            </w:r>
-            <w:r>
-              <w:rPr>
-                <w:rFonts w:ascii="Times New Roman" w:eastAsia="Calibri" w:hAnsi="Times New Roman"/>
-                <w:b/>
-                <w:bCs/>
-                <w:sz w:val="18"/>
-                <w:szCs w:val="18"/>
-                <w:lang w:eastAsia="ru-RU"/>
-              </w:rPr>
-              <w:t xml:space="preserve"> </w:t>
-            </w:r>
-            <w:r>
-              <w:rPr>
-                <w:rFonts w:ascii="Times New Roman" w:eastAsia="Calibri" w:hAnsi="Times New Roman"/>
-                <w:b/>
-                <w:bCs/>
-                <w:sz w:val="20"/>
-                <w:szCs w:val="20"/>
-                <w:u w:val="single"/>
-                <w:lang w:eastAsia="ru-RU"/>
-              </w:rPr>
-              <w:t>_</w:t>
-            </w:r>
-            <w:r>
-              <w:rPr>
-                <w:rFonts w:ascii="Times New Roman" w:eastAsia="Calibri" w:hAnsi="Times New Roman"/>
-                <w:b/>
-                <w:bCs/>
-                <w:sz w:val="20"/>
-                <w:szCs w:val="20"/>
-                <w:u w:val="single"/>
-                <w:lang w:eastAsia="ru-RU"/>
-              </w:rPr>
-              <w:t xml:space="preserve">{{ </w:t>
-            </w:r>
-            <w:r>
-              <w:rPr>
-                <w:rFonts w:ascii="Times New Roman" w:eastAsia="Calibri" w:hAnsi="Times New Roman"/>
-                <w:b/>
-                <w:bCs/>
-                <w:sz w:val="20"/>
-                <w:szCs w:val="20"/>
-                <w:u w:val="single"/>
-                <w:lang w:val="en-US" w:eastAsia="ru-RU"/>
-              </w:rPr>
-              <w:t>citizenship</w:t>
-            </w:r>
-            <w:r>
-              <w:rPr>
-                <w:rFonts w:ascii="Times New Roman" w:eastAsia="Calibri" w:hAnsi="Times New Roman"/>
-                <w:b/>
-                <w:bCs/>
-                <w:sz w:val="20"/>
-                <w:szCs w:val="20"/>
-                <w:u w:val="single"/>
-                <w:lang w:eastAsia="ru-RU"/>
-              </w:rPr>
-              <w:t xml:space="preserve"> }}</w:t>
-            </w:r>
-            <w:r>
-              <w:rPr>
-                <w:rFonts w:ascii="Times New Roman" w:eastAsia="Calibri" w:hAnsi="Times New Roman"/>
-                <w:b/>
-                <w:bCs/>
-                <w:sz w:val="20"/>
-                <w:szCs w:val="20"/>
-                <w:u w:val="single"/>
-                <w:lang w:eastAsia="ru-RU"/>
+            <w:r>
+              <w:rPr>
+                <w:rFonts w:eastAsia="Calibri"/>
+                <w:b/>
+                <w:bCs/>
+                <w:sz w:val="20"/>
+                <w:szCs w:val="20"/>
+                <w:u w:val="single"/>
               </w:rPr>
               <w:t>_</w:t>
             </w:r>
@@ -1277,10 +1646,8 @@
                 <w:tab w:val="left" w:pos="5550"/>
               </w:tabs>
               <w:spacing w:before="60" w:after="0" w:line="240" w:lineRule="auto"/>
-              <w:rPr>
-                <w:lang w:val="en-US"/>
-              </w:rPr>
-            </w:pPr>
+            </w:pPr>
+            <w:proofErr w:type="gramStart"/>
             <w:r>
               <w:rPr>
                 <w:rFonts w:ascii="Times New Roman" w:hAnsi="Times New Roman"/>
@@ -1288,9 +1655,76 @@
                 <w:bCs/>
                 <w:sz w:val="24"/>
                 <w:szCs w:val="24"/>
+                <w:lang w:eastAsia="ru-RU"/>
+              </w:rPr>
+              <w:t xml:space="preserve">{{ </w:t>
+            </w:r>
+            <w:r>
+              <w:rPr>
+                <w:rFonts w:ascii="Times New Roman" w:hAnsi="Times New Roman"/>
+                <w:b/>
+                <w:bCs/>
+                <w:sz w:val="24"/>
+                <w:szCs w:val="24"/>
                 <w:lang w:val="en-US" w:eastAsia="ru-RU"/>
               </w:rPr>
-              <w:t>{{ place_of_life }}</w:t>
+              <w:t>place</w:t>
+            </w:r>
+            <w:proofErr w:type="gramEnd"/>
+            <w:r>
+              <w:rPr>
+                <w:rFonts w:ascii="Times New Roman" w:hAnsi="Times New Roman"/>
+                <w:b/>
+                <w:bCs/>
+                <w:sz w:val="24"/>
+                <w:szCs w:val="24"/>
+                <w:lang w:eastAsia="ru-RU"/>
+              </w:rPr>
+              <w:t>_</w:t>
+            </w:r>
+            <w:r>
+              <w:rPr>
+                <w:rFonts w:ascii="Times New Roman" w:hAnsi="Times New Roman"/>
+                <w:b/>
+                <w:bCs/>
+                <w:sz w:val="24"/>
+                <w:szCs w:val="24"/>
+                <w:lang w:val="en-US" w:eastAsia="ru-RU"/>
+              </w:rPr>
+              <w:t>of</w:t>
+            </w:r>
+            <w:r>
+              <w:rPr>
+                <w:rFonts w:ascii="Times New Roman" w:hAnsi="Times New Roman"/>
+                <w:b/>
+                <w:bCs/>
+                <w:sz w:val="24"/>
+                <w:szCs w:val="24"/>
+                <w:lang w:eastAsia="ru-RU"/>
+              </w:rPr>
+              <w:t>_</w:t>
+            </w:r>
+            <w:r>
+              <w:rPr>
+                <w:rFonts w:ascii="Times New Roman" w:hAnsi="Times New Roman"/>
+                <w:b/>
+                <w:bCs/>
+                <w:sz w:val="24"/>
+                <w:szCs w:val="24"/>
+                <w:lang w:val="en-US" w:eastAsia="ru-RU"/>
+              </w:rPr>
+              <w:t>life</w:t>
+            </w:r>
+            <w:r>
+              <w:rPr>
+                <w:rFonts w:ascii="Times New Roman" w:hAnsi="Times New Roman"/>
+                <w:b/>
+                <w:bCs/>
+                <w:sz w:val="24"/>
+                <w:szCs w:val="24"/>
+                <w:lang w:eastAsia="ru-RU"/>
+              </w:rPr>
+              <w:t xml:space="preserve"> }}</w:t>
             </w:r>
           </w:p>
           <w:p>
@@ -1332,6 +1766,7 @@
               </w:rPr>
               <w:t xml:space="preserve">Написание исходного текста программы – </w:t>
             </w:r>
+            <w:proofErr w:type="gramStart"/>
             <w:r>
               <w:rPr>
                 <w:rFonts w:ascii="Times New Roman" w:eastAsia="Calibri" w:hAnsi="Times New Roman"/>
@@ -1341,6 +1776,7 @@
               </w:rPr>
               <w:t xml:space="preserve">{{ </w:t>
             </w:r>
+            <w:proofErr w:type="spellStart"/>
             <w:r>
               <w:rPr>
                 <w:rFonts w:ascii="Times New Roman" w:eastAsia="Calibri" w:hAnsi="Times New Roman"/>
@@ -1350,6 +1786,8 @@
               </w:rPr>
               <w:t>src</w:t>
             </w:r>
+            <w:proofErr w:type="spellEnd"/>
+            <w:proofErr w:type="gramEnd"/>
             <w:r>
               <w:rPr>
                 <w:rFonts w:ascii="Times New Roman" w:eastAsia="Calibri" w:hAnsi="Times New Roman"/>
@@ -1406,6 +1844,7 @@
                 <w:lang w:eastAsia="ru-RU"/>
               </w:rPr>
             </w:pPr>
+            <w:proofErr w:type="gramStart"/>
             <w:r>
               <w:rPr>
                 <w:rFonts w:ascii="Times New Roman" w:eastAsia="Calibri" w:hAnsi="Times New Roman"/>
@@ -1414,7 +1853,18 @@
                 <w:szCs w:val="20"/>
                 <w:lang w:eastAsia="ru-RU"/>
               </w:rPr>
-              <w:t>При  публикации сведений о государственной регистрации программы для ЭВМ или базы данных автор просит: (отметить [X])</w:t>
+              <w:t>При  публикации</w:t>
+            </w:r>
+            <w:proofErr w:type="gramEnd"/>
+            <w:r>
+              <w:rPr>
+                <w:rFonts w:ascii="Times New Roman" w:eastAsia="Calibri" w:hAnsi="Times New Roman"/>
+                <w:i/>
+                <w:sz w:val="20"/>
+                <w:szCs w:val="20"/>
+                <w:lang w:eastAsia="ru-RU"/>
+              </w:rPr>
+              <w:t xml:space="preserve"> сведений о государственной регистрации программы для ЭВМ или базы данных автор просит: (отметить [X])</w:t>
             </w:r>
           </w:p>
           <w:p>
@@ -1680,6 +2130,8 @@
             </w:r>
           </w:p>
         </w:tc>
+        <w:bookmarkStart w:id="54" w:name="_GoBack"/>
+        <w:bookmarkEnd w:id="54"/>
       </w:tr>
       <w:tr>
         <w:trPr>
@@ -1705,17 +2157,37 @@
                 <w:rFonts w:ascii="Times New Roman" w:eastAsia="Calibri" w:hAnsi="Times New Roman"/>
                 <w:sz w:val="24"/>
                 <w:szCs w:val="24"/>
-                <w:lang w:val="en-US" w:eastAsia="ru-RU"/>
-              </w:rPr>
-            </w:pPr>
-            <w:r>
-              <w:rPr>
-                <w:rFonts w:ascii="Times New Roman" w:eastAsia="Calibri" w:hAnsi="Times New Roman"/>
-                <w:sz w:val="24"/>
-                <w:szCs w:val="24"/>
-                <w:lang w:eastAsia="ru-RU"/>
-              </w:rPr>
-              <w:t xml:space="preserve">Подпись автора:                                                                     </w:t>
+                <w:lang w:eastAsia="ru-RU"/>
+              </w:rPr>
+            </w:pPr>
+            <w:r>
+              <w:rPr>
+                <w:rFonts w:ascii="Times New Roman" w:eastAsia="Calibri" w:hAnsi="Times New Roman"/>
+                <w:sz w:val="24"/>
+                <w:szCs w:val="24"/>
+                <w:lang w:eastAsia="ru-RU"/>
+              </w:rPr>
+              <w:t xml:space="preserve">Подпись </w:t>
+            </w:r>
+            <w:proofErr w:type="gramStart"/>
+            <w:r>
+              <w:rPr>
+                <w:rFonts w:ascii="Times New Roman" w:eastAsia="Calibri" w:hAnsi="Times New Roman"/>
+                <w:sz w:val="24"/>
+                <w:szCs w:val="24"/>
+                <w:lang w:eastAsia="ru-RU"/>
+              </w:rPr>
+              <w:t xml:space="preserve">автора:   </w:t>
+            </w:r>
+            <w:proofErr w:type="gramEnd"/>
+            <w:r>
+              <w:rPr>
+                <w:rFonts w:ascii="Times New Roman" w:eastAsia="Calibri" w:hAnsi="Times New Roman"/>
+                <w:sz w:val="24"/>
+                <w:szCs w:val="24"/>
+                <w:lang w:eastAsia="ru-RU"/>
+              </w:rPr>
+              <w:t xml:space="preserve">                                                                  </w:t>
             </w:r>
             <w:r>
               <w:rPr>
@@ -1726,12 +2198,10 @@
                 <w:spacing w:val="-2"/>
                 <w:sz w:val="24"/>
                 <w:szCs w:val="24"/>
-                <w:lang w:val="en-US" w:eastAsia="ru-RU"/>
-              </w:rPr>
-              <w:t>{{ authors_name</w:t>
-            </w:r>
-            <w:bookmarkStart w:id="54" w:name="_GoBack"/>
-            <w:bookmarkEnd w:id="54"/>
+                <w:lang w:eastAsia="ru-RU"/>
+              </w:rPr>
+              <w:t xml:space="preserve">{{ </w:t>
+            </w:r>
             <w:r>
               <w:rPr>
                 <w:rFonts w:ascii="Times New Roman" w:eastAsia="Calibri" w:hAnsi="Times New Roman"/>
@@ -1742,6 +2212,45 @@
                 <w:sz w:val="24"/>
                 <w:szCs w:val="24"/>
                 <w:lang w:val="en-US" w:eastAsia="ru-RU"/>
+              </w:rPr>
+              <w:t>authors</w:t>
+            </w:r>
+            <w:r>
+              <w:rPr>
+                <w:rFonts w:ascii="Times New Roman" w:eastAsia="Calibri" w:hAnsi="Times New Roman"/>
+                <w:b/>
+                <w:iCs/>
+                <w:color w:val="C9211E"/>
+                <w:spacing w:val="-2"/>
+                <w:sz w:val="24"/>
+                <w:szCs w:val="24"/>
+                <w:lang w:eastAsia="ru-RU"/>
+              </w:rPr>
+              <w:t>_</w:t>
+            </w:r>
+            <w:r>
+              <w:rPr>
+                <w:rFonts w:ascii="Times New Roman" w:eastAsia="Calibri" w:hAnsi="Times New Roman"/>
+                <w:b/>
+                <w:iCs/>
+                <w:color w:val="C9211E"/>
+                <w:spacing w:val="-2"/>
+                <w:sz w:val="24"/>
+                <w:szCs w:val="24"/>
+                <w:lang w:val="en-US" w:eastAsia="ru-RU"/>
+              </w:rPr>
+              <w:t>name</w:t>
+            </w:r>
+            <w:r>
+              <w:rPr>
+                <w:rFonts w:ascii="Times New Roman" w:eastAsia="Calibri" w:hAnsi="Times New Roman"/>
+                <w:b/>
+                <w:iCs/>
+                <w:color w:val="C9211E"/>
+                <w:spacing w:val="-2"/>
+                <w:sz w:val="24"/>
+                <w:szCs w:val="24"/>
+                <w:lang w:eastAsia="ru-RU"/>
               </w:rPr>
               <w:t xml:space="preserve"> }}</w:t>
             </w:r>
@@ -1854,16 +2363,42 @@
                 <w:sz w:val="22"/>
                 <w:u w:val="single"/>
               </w:rPr>
-              <w:t>_______</w:t>
-            </w:r>
+              <w:t>______</w:t>
+            </w:r>
+            <w:proofErr w:type="gramStart"/>
             <w:r>
               <w:rPr>
                 <w:b/>
                 <w:sz w:val="22"/>
                 <w:u w:val="single"/>
+              </w:rPr>
+              <w:t>_</w:t>
+            </w:r>
+            <w:r>
+              <w:rPr>
+                <w:b/>
+                <w:sz w:val="22"/>
+                <w:u w:val="single"/>
+              </w:rPr>
+              <w:t>{</w:t>
+            </w:r>
+            <w:proofErr w:type="gramEnd"/>
+            <w:r>
+              <w:rPr>
+                <w:b/>
+                <w:sz w:val="22"/>
+                <w:u w:val="single"/>
+              </w:rPr>
+              <w:t xml:space="preserve">{ </w:t>
+            </w:r>
+            <w:r>
+              <w:rPr>
+                <w:b/>
+                <w:sz w:val="22"/>
+                <w:u w:val="single"/>
                 <w:lang w:val="en-US"/>
               </w:rPr>
-              <w:t>{{ role }}</w:t>
+              <w:t>role</w:t>
             </w:r>
             <w:r>
               <w:rPr>
@@ -1871,6 +2406,14 @@
                 <w:sz w:val="22"/>
                 <w:u w:val="single"/>
               </w:rPr>
+              <w:t xml:space="preserve"> }}</w:t>
+            </w:r>
+            <w:r>
+              <w:rPr>
+                <w:b/>
+                <w:sz w:val="22"/>
+                <w:u w:val="single"/>
+              </w:rPr>
               <w:t xml:space="preserve">    ________________________________</w:t>
             </w:r>
             <w:r>
@@ -1878,27 +2421,59 @@
                 <w:b/>
                 <w:sz w:val="22"/>
                 <w:u w:val="single"/>
+              </w:rPr>
+              <w:t xml:space="preserve">{{ </w:t>
+            </w:r>
+            <w:r>
+              <w:rPr>
+                <w:b/>
+                <w:sz w:val="22"/>
+                <w:u w:val="single"/>
                 <w:lang w:val="en-US"/>
               </w:rPr>
-              <w:t>{{</w:t>
+              <w:t>copyright</w:t>
             </w:r>
             <w:r>
               <w:rPr>
                 <w:b/>
                 <w:sz w:val="22"/>
                 <w:u w:val="single"/>
+              </w:rPr>
+              <w:t>_</w:t>
+            </w:r>
+            <w:r>
+              <w:rPr>
+                <w:b/>
+                <w:sz w:val="22"/>
+                <w:u w:val="single"/>
                 <w:lang w:val="en-US"/>
               </w:rPr>
-              <w:t xml:space="preserve"> copyright_holder_name </w:t>
+              <w:t>holder</w:t>
             </w:r>
             <w:r>
               <w:rPr>
                 <w:b/>
                 <w:sz w:val="22"/>
                 <w:u w:val="single"/>
+              </w:rPr>
+              <w:t>_</w:t>
+            </w:r>
+            <w:r>
+              <w:rPr>
+                <w:b/>
+                <w:sz w:val="22"/>
+                <w:u w:val="single"/>
                 <w:lang w:val="en-US"/>
               </w:rPr>
-              <w:t>}}</w:t>
+              <w:t>name</w:t>
+            </w:r>
+            <w:r>
+              <w:rPr>
+                <w:b/>
+                <w:sz w:val="22"/>
+                <w:u w:val="single"/>
+              </w:rPr>
+              <w:t xml:space="preserve"> }}</w:t>
             </w:r>
             <w:r>
               <w:rPr>
@@ -2554,6 +3129,21 @@
       <w:bCs/>
     </w:rPr>
   </w:style>
+  <w:style w:type="paragraph" w:customStyle="1" w:styleId="western">
+    <w:name w:val="western"/>
+    <w:basedOn w:val="a"/>
+    <w:rsid w:val="00BA4AD7"/>
+    <w:pPr>
+      <w:suppressAutoHyphens w:val="0"/>
+      <w:spacing w:before="100" w:beforeAutospacing="1" w:after="100" w:afterAutospacing="1" w:line="240" w:lineRule="auto"/>
+    </w:pPr>
+    <w:rPr>
+      <w:rFonts w:ascii="Times New Roman" w:hAnsi="Times New Roman"/>
+      <w:sz w:val="24"/>
+      <w:szCs w:val="24"/>
+      <w:lang w:eastAsia="ru-RU"/>
+    </w:rPr>
+  </w:style>
 </w:styles>
 </file>
 

</xml_diff>